<commit_message>
Documenta métodos dos casos de uso e atualiza sequências da Sprint 1
</commit_message>
<xml_diff>
--- a/docs/entrega-sprint-1.docx
+++ b/docs/entrega-sprint-1.docx
@@ -1032,11 +1032,443 @@
         <w:t xml:space="preserve">Resultado esperado: o usuário acessa as funcionalidades disponíveis para seu perfil.</w:t>
       </w:r>
     </w:p>
+    <w:tbl>
+      <w:tblPr>
+        <w:tblStyle w:val="Table"/>
+        <w:tblW w:type="pct" w:w="5000"/>
+        <w:jc w:val="center"/>
+        <w:tblLayout w:type="fixed"/>
+        <w:tblLook w:firstRow="1" w:lastRow="0" w:firstColumn="0" w:lastColumn="0" w:noHBand="0" w:noVBand="0" w:val="0020"/>
+        <w:tblBorders>
+          <w:top w:val="single" w:sz="4" w:color="CCD3D7"/>
+          <w:left w:val="single" w:sz="4" w:color="CCD3D7"/>
+          <w:bottom w:val="single" w:sz="4" w:color="CCD3D7"/>
+          <w:right w:val="single" w:sz="4" w:color="CCD3D7"/>
+          <w:insideH w:val="single" w:sz="4" w:color="CCD3D7"/>
+          <w:insideV w:val="single" w:sz="4" w:color="CCD3D7"/>
+        </w:tblBorders>
+      </w:tblPr>
+      <w:tblGrid>
+        <w:gridCol w:w="3592"/>
+        <w:gridCol w:w="2594"/>
+        <w:gridCol w:w="3792"/>
+      </w:tblGrid>
+      <w:tr>
+        <w:trPr>
+          <w:tblHeader w:val="true"/>
+          <w:cantSplit/>
+          <w:tblHeader/>
+        </w:trPr>
+        <w:tc>
+          <w:tcPr>
+            <w:tcW w:type="dxa" w:w="3592"/>
+            <w:vAlign w:val="center"/>
+            <w:shd w:fill="EDF1F2"/>
+          </w:tcPr>
+          <w:p>
+            <w:pPr>
+              <w:pStyle w:val="Compact"/>
+              <w:spacing w:before="60" w:after="60" w:line="252" w:lineRule="auto"/>
+              <w:jc w:val="left"/>
+            </w:pPr>
+            <w:r>
+              <w:rPr>
+                <w:b/>
+                <w:sz w:val="21"/>
+              </w:rPr>
+              <w:t xml:space="preserve">Método/função</w:t>
+            </w:r>
+          </w:p>
+        </w:tc>
+        <w:tc>
+          <w:tcPr>
+            <w:tcW w:type="dxa" w:w="2594"/>
+            <w:vAlign w:val="center"/>
+            <w:shd w:fill="EDF1F2"/>
+          </w:tcPr>
+          <w:p>
+            <w:pPr>
+              <w:pStyle w:val="Compact"/>
+              <w:spacing w:before="60" w:after="60" w:line="252" w:lineRule="auto"/>
+              <w:jc w:val="left"/>
+            </w:pPr>
+            <w:r>
+              <w:rPr>
+                <w:b/>
+                <w:sz w:val="21"/>
+              </w:rPr>
+              <w:t xml:space="preserve">Classe ou módulo</w:t>
+            </w:r>
+          </w:p>
+        </w:tc>
+        <w:tc>
+          <w:tcPr>
+            <w:tcW w:type="dxa" w:w="3792"/>
+            <w:vAlign w:val="center"/>
+            <w:shd w:fill="EDF1F2"/>
+          </w:tcPr>
+          <w:p>
+            <w:pPr>
+              <w:pStyle w:val="Compact"/>
+              <w:spacing w:before="60" w:after="60" w:line="252" w:lineRule="auto"/>
+              <w:jc w:val="left"/>
+            </w:pPr>
+            <w:r>
+              <w:rPr>
+                <w:b/>
+                <w:sz w:val="21"/>
+              </w:rPr>
+              <w:t xml:space="preserve">Responsabilidade no caso de uso</w:t>
+            </w:r>
+          </w:p>
+        </w:tc>
+      </w:tr>
+      <w:tr>
+        <w:trPr>
+          <w:cantSplit/>
+        </w:trPr>
+        <w:tc>
+          <w:tcPr>
+            <w:tcW w:type="dxa" w:w="3592"/>
+            <w:vAlign w:val="center"/>
+          </w:tcPr>
+          <w:p>
+            <w:pPr>
+              <w:pStyle w:val="Compact"/>
+              <w:spacing w:before="60" w:after="60" w:line="252" w:lineRule="auto"/>
+              <w:jc w:val="left"/>
+            </w:pPr>
+            <w:r>
+              <w:rPr>
+                <w:rStyle w:val="VerbatimChar"/>
+                <w:sz w:val="18"/>
+              </w:rPr>
+              <w:t xml:space="preserve">login()</w:t>
+            </w:r>
+          </w:p>
+        </w:tc>
+        <w:tc>
+          <w:tcPr>
+            <w:tcW w:type="dxa" w:w="2594"/>
+            <w:vAlign w:val="center"/>
+          </w:tcPr>
+          <w:p>
+            <w:pPr>
+              <w:pStyle w:val="Compact"/>
+              <w:spacing w:before="60" w:after="60" w:line="252" w:lineRule="auto"/>
+              <w:jc w:val="left"/>
+            </w:pPr>
+            <w:r>
+              <w:rPr>
+                <w:rStyle w:val="VerbatimChar"/>
+                <w:sz w:val="18"/>
+              </w:rPr>
+              <w:t xml:space="preserve">helpdesk.routes</w:t>
+            </w:r>
+          </w:p>
+        </w:tc>
+        <w:tc>
+          <w:tcPr>
+            <w:tcW w:type="dxa" w:w="3792"/>
+            <w:vAlign w:val="center"/>
+          </w:tcPr>
+          <w:p>
+            <w:pPr>
+              <w:pStyle w:val="Compact"/>
+              <w:spacing w:before="60" w:after="60" w:line="252" w:lineRule="auto"/>
+              <w:jc w:val="left"/>
+            </w:pPr>
+            <w:r>
+              <w:rPr>
+                <w:sz w:val="21"/>
+              </w:rPr>
+              <w:t xml:space="preserve">Recebe os dados e coordena o acesso do usuário</w:t>
+            </w:r>
+          </w:p>
+        </w:tc>
+      </w:tr>
+      <w:tr>
+        <w:trPr>
+          <w:cantSplit/>
+        </w:trPr>
+        <w:tc>
+          <w:tcPr>
+            <w:tcW w:type="dxa" w:w="3592"/>
+            <w:vAlign w:val="center"/>
+          </w:tcPr>
+          <w:p>
+            <w:pPr>
+              <w:pStyle w:val="Compact"/>
+              <w:spacing w:before="60" w:after="60" w:line="252" w:lineRule="auto"/>
+              <w:jc w:val="left"/>
+            </w:pPr>
+            <w:r>
+              <w:rPr>
+                <w:rStyle w:val="VerbatimChar"/>
+                <w:sz w:val="18"/>
+              </w:rPr>
+              <w:t xml:space="preserve">authenticate(user, password)</w:t>
+            </w:r>
+          </w:p>
+        </w:tc>
+        <w:tc>
+          <w:tcPr>
+            <w:tcW w:type="dxa" w:w="2594"/>
+            <w:vAlign w:val="center"/>
+          </w:tcPr>
+          <w:p>
+            <w:pPr>
+              <w:pStyle w:val="Compact"/>
+              <w:spacing w:before="60" w:after="60" w:line="252" w:lineRule="auto"/>
+              <w:jc w:val="left"/>
+            </w:pPr>
+            <w:r>
+              <w:rPr>
+                <w:rStyle w:val="VerbatimChar"/>
+                <w:sz w:val="18"/>
+              </w:rPr>
+              <w:t xml:space="preserve">helpdesk.security</w:t>
+            </w:r>
+          </w:p>
+        </w:tc>
+        <w:tc>
+          <w:tcPr>
+            <w:tcW w:type="dxa" w:w="3792"/>
+            <w:vAlign w:val="center"/>
+          </w:tcPr>
+          <w:p>
+            <w:pPr>
+              <w:pStyle w:val="Compact"/>
+              <w:spacing w:before="60" w:after="60" w:line="252" w:lineRule="auto"/>
+              <w:jc w:val="left"/>
+            </w:pPr>
+            <w:r>
+              <w:rPr>
+                <w:sz w:val="21"/>
+              </w:rPr>
+              <w:t xml:space="preserve">Verifica as credenciais informadas</w:t>
+            </w:r>
+          </w:p>
+        </w:tc>
+      </w:tr>
+      <w:tr>
+        <w:trPr>
+          <w:cantSplit/>
+        </w:trPr>
+        <w:tc>
+          <w:tcPr>
+            <w:tcW w:type="dxa" w:w="3592"/>
+            <w:vAlign w:val="center"/>
+          </w:tcPr>
+          <w:p>
+            <w:pPr>
+              <w:pStyle w:val="Compact"/>
+              <w:spacing w:before="60" w:after="60" w:line="252" w:lineRule="auto"/>
+              <w:jc w:val="left"/>
+            </w:pPr>
+            <w:r>
+              <w:rPr>
+                <w:rStyle w:val="VerbatimChar"/>
+                <w:sz w:val="18"/>
+              </w:rPr>
+              <w:t xml:space="preserve">check_password(password)</w:t>
+            </w:r>
+          </w:p>
+        </w:tc>
+        <w:tc>
+          <w:tcPr>
+            <w:tcW w:type="dxa" w:w="2594"/>
+            <w:vAlign w:val="center"/>
+          </w:tcPr>
+          <w:p>
+            <w:pPr>
+              <w:pStyle w:val="Compact"/>
+              <w:spacing w:before="60" w:after="60" w:line="252" w:lineRule="auto"/>
+              <w:jc w:val="left"/>
+            </w:pPr>
+            <w:r>
+              <w:rPr>
+                <w:rStyle w:val="VerbatimChar"/>
+                <w:sz w:val="18"/>
+              </w:rPr>
+              <w:t xml:space="preserve">User</w:t>
+            </w:r>
+            <w:r>
+              <w:rPr>
+                <w:sz w:val="21"/>
+              </w:rPr>
+              <w:t xml:space="preserve">, em</w:t>
+            </w:r>
+            <w:r>
+              <w:rPr>
+                <w:sz w:val="21"/>
+              </w:rPr>
+              <w:t xml:space="preserve"> </w:t>
+            </w:r>
+            <w:r>
+              <w:rPr>
+                <w:rStyle w:val="VerbatimChar"/>
+                <w:sz w:val="18"/>
+              </w:rPr>
+              <w:t xml:space="preserve">helpdesk.models</w:t>
+            </w:r>
+          </w:p>
+        </w:tc>
+        <w:tc>
+          <w:tcPr>
+            <w:tcW w:type="dxa" w:w="3792"/>
+            <w:vAlign w:val="center"/>
+          </w:tcPr>
+          <w:p>
+            <w:pPr>
+              <w:pStyle w:val="Compact"/>
+              <w:spacing w:before="60" w:after="60" w:line="252" w:lineRule="auto"/>
+              <w:jc w:val="left"/>
+            </w:pPr>
+            <w:r>
+              <w:rPr>
+                <w:sz w:val="21"/>
+              </w:rPr>
+              <w:t xml:space="preserve">Confere a senha da conta</w:t>
+            </w:r>
+          </w:p>
+        </w:tc>
+      </w:tr>
+      <w:tr>
+        <w:trPr>
+          <w:cantSplit/>
+        </w:trPr>
+        <w:tc>
+          <w:tcPr>
+            <w:tcW w:type="dxa" w:w="3592"/>
+            <w:vAlign w:val="center"/>
+          </w:tcPr>
+          <w:p>
+            <w:pPr>
+              <w:pStyle w:val="Compact"/>
+              <w:spacing w:before="60" w:after="60" w:line="252" w:lineRule="auto"/>
+              <w:jc w:val="left"/>
+            </w:pPr>
+            <w:r>
+              <w:rPr>
+                <w:rStyle w:val="VerbatimChar"/>
+                <w:sz w:val="18"/>
+              </w:rPr>
+              <w:t xml:space="preserve">start_session(user)</w:t>
+            </w:r>
+          </w:p>
+        </w:tc>
+        <w:tc>
+          <w:tcPr>
+            <w:tcW w:type="dxa" w:w="2594"/>
+            <w:vAlign w:val="center"/>
+          </w:tcPr>
+          <w:p>
+            <w:pPr>
+              <w:pStyle w:val="Compact"/>
+              <w:spacing w:before="60" w:after="60" w:line="252" w:lineRule="auto"/>
+              <w:jc w:val="left"/>
+            </w:pPr>
+            <w:r>
+              <w:rPr>
+                <w:rStyle w:val="VerbatimChar"/>
+                <w:sz w:val="18"/>
+              </w:rPr>
+              <w:t xml:space="preserve">helpdesk.security</w:t>
+            </w:r>
+          </w:p>
+        </w:tc>
+        <w:tc>
+          <w:tcPr>
+            <w:tcW w:type="dxa" w:w="3792"/>
+            <w:vAlign w:val="center"/>
+          </w:tcPr>
+          <w:p>
+            <w:pPr>
+              <w:pStyle w:val="Compact"/>
+              <w:spacing w:before="60" w:after="60" w:line="252" w:lineRule="auto"/>
+              <w:jc w:val="left"/>
+            </w:pPr>
+            <w:r>
+              <w:rPr>
+                <w:sz w:val="21"/>
+              </w:rPr>
+              <w:t xml:space="preserve">Inicia o acesso autenticado</w:t>
+            </w:r>
+          </w:p>
+        </w:tc>
+      </w:tr>
+      <w:tr>
+        <w:trPr>
+          <w:cantSplit/>
+        </w:trPr>
+        <w:tc>
+          <w:tcPr>
+            <w:tcW w:type="dxa" w:w="3592"/>
+            <w:vAlign w:val="center"/>
+          </w:tcPr>
+          <w:p>
+            <w:pPr>
+              <w:pStyle w:val="Compact"/>
+              <w:spacing w:before="60" w:after="60" w:line="252" w:lineRule="auto"/>
+              <w:jc w:val="left"/>
+            </w:pPr>
+            <w:r>
+              <w:rPr>
+                <w:rStyle w:val="VerbatimChar"/>
+                <w:sz w:val="18"/>
+              </w:rPr>
+              <w:t xml:space="preserve">home()</w:t>
+            </w:r>
+          </w:p>
+        </w:tc>
+        <w:tc>
+          <w:tcPr>
+            <w:tcW w:type="dxa" w:w="2594"/>
+            <w:vAlign w:val="center"/>
+          </w:tcPr>
+          <w:p>
+            <w:pPr>
+              <w:pStyle w:val="Compact"/>
+              <w:spacing w:before="60" w:after="60" w:line="252" w:lineRule="auto"/>
+              <w:jc w:val="left"/>
+            </w:pPr>
+            <w:r>
+              <w:rPr>
+                <w:rStyle w:val="VerbatimChar"/>
+                <w:sz w:val="18"/>
+              </w:rPr>
+              <w:t xml:space="preserve">helpdesk.routes</w:t>
+            </w:r>
+          </w:p>
+        </w:tc>
+        <w:tc>
+          <w:tcPr>
+            <w:tcW w:type="dxa" w:w="3792"/>
+            <w:vAlign w:val="center"/>
+          </w:tcPr>
+          <w:p>
+            <w:pPr>
+              <w:pStyle w:val="Compact"/>
+              <w:spacing w:before="60" w:after="60" w:line="252" w:lineRule="auto"/>
+              <w:jc w:val="left"/>
+            </w:pPr>
+            <w:r>
+              <w:rPr>
+                <w:sz w:val="21"/>
+              </w:rPr>
+              <w:t xml:space="preserve">Apresenta a página inicial do perfil</w:t>
+            </w:r>
+          </w:p>
+        </w:tc>
+      </w:tr>
+    </w:tbl>
     <w:bookmarkEnd w:id="25"/>
     <w:bookmarkStart w:id="26" w:name="uc02-realizar-logout"/>
     <w:p>
       <w:pPr>
         <w:pStyle w:val="Heading3"/>
+        <w:pageBreakBefore/>
       </w:pPr>
       <w:r>
         <w:t xml:space="preserve">UC02: realizar logout</w:t>
@@ -1102,12 +1534,231 @@
         <w:t xml:space="preserve">Resultado esperado: o usuário sai da conta e precisa se autenticar para voltar às páginas restritas.</w:t>
       </w:r>
     </w:p>
+    <w:tbl>
+      <w:tblPr>
+        <w:tblStyle w:val="Table"/>
+        <w:tblW w:type="pct" w:w="5000"/>
+        <w:jc w:val="center"/>
+        <w:tblLayout w:type="fixed"/>
+        <w:tblLook w:firstRow="1" w:lastRow="0" w:firstColumn="0" w:lastColumn="0" w:noHBand="0" w:noVBand="0" w:val="0020"/>
+        <w:tblBorders>
+          <w:top w:val="single" w:sz="4" w:color="CCD3D7"/>
+          <w:left w:val="single" w:sz="4" w:color="CCD3D7"/>
+          <w:bottom w:val="single" w:sz="4" w:color="CCD3D7"/>
+          <w:right w:val="single" w:sz="4" w:color="CCD3D7"/>
+          <w:insideH w:val="single" w:sz="4" w:color="CCD3D7"/>
+          <w:insideV w:val="single" w:sz="4" w:color="CCD3D7"/>
+        </w:tblBorders>
+      </w:tblPr>
+      <w:tblGrid>
+        <w:gridCol w:w="3592"/>
+        <w:gridCol w:w="2594"/>
+        <w:gridCol w:w="3792"/>
+      </w:tblGrid>
+      <w:tr>
+        <w:trPr>
+          <w:tblHeader w:val="true"/>
+          <w:cantSplit/>
+          <w:tblHeader/>
+        </w:trPr>
+        <w:tc>
+          <w:tcPr>
+            <w:tcW w:type="dxa" w:w="3592"/>
+            <w:vAlign w:val="center"/>
+            <w:shd w:fill="EDF1F2"/>
+          </w:tcPr>
+          <w:p>
+            <w:pPr>
+              <w:pStyle w:val="Compact"/>
+              <w:spacing w:before="60" w:after="60" w:line="252" w:lineRule="auto"/>
+              <w:jc w:val="left"/>
+            </w:pPr>
+            <w:r>
+              <w:rPr>
+                <w:b/>
+                <w:sz w:val="21"/>
+              </w:rPr>
+              <w:t xml:space="preserve">Método/função</w:t>
+            </w:r>
+          </w:p>
+        </w:tc>
+        <w:tc>
+          <w:tcPr>
+            <w:tcW w:type="dxa" w:w="2594"/>
+            <w:vAlign w:val="center"/>
+            <w:shd w:fill="EDF1F2"/>
+          </w:tcPr>
+          <w:p>
+            <w:pPr>
+              <w:pStyle w:val="Compact"/>
+              <w:spacing w:before="60" w:after="60" w:line="252" w:lineRule="auto"/>
+              <w:jc w:val="left"/>
+            </w:pPr>
+            <w:r>
+              <w:rPr>
+                <w:b/>
+                <w:sz w:val="21"/>
+              </w:rPr>
+              <w:t xml:space="preserve">Classe ou módulo</w:t>
+            </w:r>
+          </w:p>
+        </w:tc>
+        <w:tc>
+          <w:tcPr>
+            <w:tcW w:type="dxa" w:w="3792"/>
+            <w:vAlign w:val="center"/>
+            <w:shd w:fill="EDF1F2"/>
+          </w:tcPr>
+          <w:p>
+            <w:pPr>
+              <w:pStyle w:val="Compact"/>
+              <w:spacing w:before="60" w:after="60" w:line="252" w:lineRule="auto"/>
+              <w:jc w:val="left"/>
+            </w:pPr>
+            <w:r>
+              <w:rPr>
+                <w:b/>
+                <w:sz w:val="21"/>
+              </w:rPr>
+              <w:t xml:space="preserve">Responsabilidade no caso de uso</w:t>
+            </w:r>
+          </w:p>
+        </w:tc>
+      </w:tr>
+      <w:tr>
+        <w:trPr>
+          <w:cantSplit/>
+        </w:trPr>
+        <w:tc>
+          <w:tcPr>
+            <w:tcW w:type="dxa" w:w="3592"/>
+            <w:vAlign w:val="center"/>
+          </w:tcPr>
+          <w:p>
+            <w:pPr>
+              <w:pStyle w:val="Compact"/>
+              <w:spacing w:before="60" w:after="60" w:line="252" w:lineRule="auto"/>
+              <w:jc w:val="left"/>
+            </w:pPr>
+            <w:r>
+              <w:rPr>
+                <w:rStyle w:val="VerbatimChar"/>
+                <w:sz w:val="18"/>
+              </w:rPr>
+              <w:t xml:space="preserve">require_user()</w:t>
+            </w:r>
+          </w:p>
+        </w:tc>
+        <w:tc>
+          <w:tcPr>
+            <w:tcW w:type="dxa" w:w="2594"/>
+            <w:vAlign w:val="center"/>
+          </w:tcPr>
+          <w:p>
+            <w:pPr>
+              <w:pStyle w:val="Compact"/>
+              <w:spacing w:before="60" w:after="60" w:line="252" w:lineRule="auto"/>
+              <w:jc w:val="left"/>
+            </w:pPr>
+            <w:r>
+              <w:rPr>
+                <w:rStyle w:val="VerbatimChar"/>
+                <w:sz w:val="18"/>
+              </w:rPr>
+              <w:t xml:space="preserve">helpdesk.security</w:t>
+            </w:r>
+          </w:p>
+        </w:tc>
+        <w:tc>
+          <w:tcPr>
+            <w:tcW w:type="dxa" w:w="3792"/>
+            <w:vAlign w:val="center"/>
+          </w:tcPr>
+          <w:p>
+            <w:pPr>
+              <w:pStyle w:val="Compact"/>
+              <w:spacing w:before="60" w:after="60" w:line="252" w:lineRule="auto"/>
+              <w:jc w:val="left"/>
+            </w:pPr>
+            <w:r>
+              <w:rPr>
+                <w:sz w:val="21"/>
+              </w:rPr>
+              <w:t xml:space="preserve">Exige autenticação para acessar a rota de saída</w:t>
+            </w:r>
+          </w:p>
+        </w:tc>
+      </w:tr>
+      <w:tr>
+        <w:trPr>
+          <w:cantSplit/>
+        </w:trPr>
+        <w:tc>
+          <w:tcPr>
+            <w:tcW w:type="dxa" w:w="3592"/>
+            <w:vAlign w:val="center"/>
+          </w:tcPr>
+          <w:p>
+            <w:pPr>
+              <w:pStyle w:val="Compact"/>
+              <w:spacing w:before="60" w:after="60" w:line="252" w:lineRule="auto"/>
+              <w:jc w:val="left"/>
+            </w:pPr>
+            <w:r>
+              <w:rPr>
+                <w:rStyle w:val="VerbatimChar"/>
+                <w:sz w:val="18"/>
+              </w:rPr>
+              <w:t xml:space="preserve">logout()</w:t>
+            </w:r>
+          </w:p>
+        </w:tc>
+        <w:tc>
+          <w:tcPr>
+            <w:tcW w:type="dxa" w:w="2594"/>
+            <w:vAlign w:val="center"/>
+          </w:tcPr>
+          <w:p>
+            <w:pPr>
+              <w:pStyle w:val="Compact"/>
+              <w:spacing w:before="60" w:after="60" w:line="252" w:lineRule="auto"/>
+              <w:jc w:val="left"/>
+            </w:pPr>
+            <w:r>
+              <w:rPr>
+                <w:rStyle w:val="VerbatimChar"/>
+                <w:sz w:val="18"/>
+              </w:rPr>
+              <w:t xml:space="preserve">helpdesk.routes</w:t>
+            </w:r>
+          </w:p>
+        </w:tc>
+        <w:tc>
+          <w:tcPr>
+            <w:tcW w:type="dxa" w:w="3792"/>
+            <w:vAlign w:val="center"/>
+          </w:tcPr>
+          <w:p>
+            <w:pPr>
+              <w:pStyle w:val="Compact"/>
+              <w:spacing w:before="60" w:after="60" w:line="252" w:lineRule="auto"/>
+              <w:jc w:val="left"/>
+            </w:pPr>
+            <w:r>
+              <w:rPr>
+                <w:sz w:val="21"/>
+              </w:rPr>
+              <w:t xml:space="preserve">Encerra o acesso e retorna à página de login</w:t>
+            </w:r>
+          </w:p>
+        </w:tc>
+      </w:tr>
+    </w:tbl>
     <w:bookmarkEnd w:id="26"/>
     <w:bookmarkStart w:id="27" w:name="uc03-abrir-chamado"/>
     <w:p>
       <w:pPr>
         <w:pStyle w:val="Heading3"/>
-        <w:pageBreakBefore/>
       </w:pPr>
       <w:r>
         <w:t xml:space="preserve">UC03: abrir chamado</w:t>
@@ -1197,12 +1848,444 @@
         <w:t xml:space="preserve">Resultado esperado: o chamado fica registrado e o solicitante recebe seu protocolo.</w:t>
       </w:r>
     </w:p>
+    <w:tbl>
+      <w:tblPr>
+        <w:tblStyle w:val="Table"/>
+        <w:tblW w:type="pct" w:w="5000"/>
+        <w:jc w:val="center"/>
+        <w:tblLayout w:type="fixed"/>
+        <w:tblLook w:firstRow="1" w:lastRow="0" w:firstColumn="0" w:lastColumn="0" w:noHBand="0" w:noVBand="0" w:val="0020"/>
+        <w:tblBorders>
+          <w:top w:val="single" w:sz="4" w:color="CCD3D7"/>
+          <w:left w:val="single" w:sz="4" w:color="CCD3D7"/>
+          <w:bottom w:val="single" w:sz="4" w:color="CCD3D7"/>
+          <w:right w:val="single" w:sz="4" w:color="CCD3D7"/>
+          <w:insideH w:val="single" w:sz="4" w:color="CCD3D7"/>
+          <w:insideV w:val="single" w:sz="4" w:color="CCD3D7"/>
+        </w:tblBorders>
+      </w:tblPr>
+      <w:tblGrid>
+        <w:gridCol w:w="3592"/>
+        <w:gridCol w:w="2594"/>
+        <w:gridCol w:w="3792"/>
+      </w:tblGrid>
+      <w:tr>
+        <w:trPr>
+          <w:tblHeader w:val="true"/>
+          <w:cantSplit/>
+          <w:tblHeader/>
+        </w:trPr>
+        <w:tc>
+          <w:tcPr>
+            <w:tcW w:type="dxa" w:w="3592"/>
+            <w:vAlign w:val="center"/>
+            <w:shd w:fill="EDF1F2"/>
+          </w:tcPr>
+          <w:p>
+            <w:pPr>
+              <w:pStyle w:val="Compact"/>
+              <w:spacing w:before="60" w:after="60" w:line="252" w:lineRule="auto"/>
+              <w:jc w:val="left"/>
+            </w:pPr>
+            <w:r>
+              <w:rPr>
+                <w:b/>
+                <w:sz w:val="21"/>
+              </w:rPr>
+              <w:t xml:space="preserve">Método/função</w:t>
+            </w:r>
+          </w:p>
+        </w:tc>
+        <w:tc>
+          <w:tcPr>
+            <w:tcW w:type="dxa" w:w="2594"/>
+            <w:vAlign w:val="center"/>
+            <w:shd w:fill="EDF1F2"/>
+          </w:tcPr>
+          <w:p>
+            <w:pPr>
+              <w:pStyle w:val="Compact"/>
+              <w:spacing w:before="60" w:after="60" w:line="252" w:lineRule="auto"/>
+              <w:jc w:val="left"/>
+            </w:pPr>
+            <w:r>
+              <w:rPr>
+                <w:b/>
+                <w:sz w:val="21"/>
+              </w:rPr>
+              <w:t xml:space="preserve">Classe ou módulo</w:t>
+            </w:r>
+          </w:p>
+        </w:tc>
+        <w:tc>
+          <w:tcPr>
+            <w:tcW w:type="dxa" w:w="3792"/>
+            <w:vAlign w:val="center"/>
+            <w:shd w:fill="EDF1F2"/>
+          </w:tcPr>
+          <w:p>
+            <w:pPr>
+              <w:pStyle w:val="Compact"/>
+              <w:spacing w:before="60" w:after="60" w:line="252" w:lineRule="auto"/>
+              <w:jc w:val="left"/>
+            </w:pPr>
+            <w:r>
+              <w:rPr>
+                <w:b/>
+                <w:sz w:val="21"/>
+              </w:rPr>
+              <w:t xml:space="preserve">Responsabilidade no caso de uso</w:t>
+            </w:r>
+          </w:p>
+        </w:tc>
+      </w:tr>
+      <w:tr>
+        <w:trPr>
+          <w:cantSplit/>
+        </w:trPr>
+        <w:tc>
+          <w:tcPr>
+            <w:tcW w:type="dxa" w:w="3592"/>
+            <w:vAlign w:val="center"/>
+          </w:tcPr>
+          <w:p>
+            <w:pPr>
+              <w:pStyle w:val="Compact"/>
+              <w:spacing w:before="60" w:after="60" w:line="252" w:lineRule="auto"/>
+              <w:jc w:val="left"/>
+            </w:pPr>
+            <w:r>
+              <w:rPr>
+                <w:rStyle w:val="VerbatimChar"/>
+                <w:sz w:val="18"/>
+              </w:rPr>
+              <w:t xml:space="preserve">require_user("solicitante")</w:t>
+            </w:r>
+          </w:p>
+        </w:tc>
+        <w:tc>
+          <w:tcPr>
+            <w:tcW w:type="dxa" w:w="2594"/>
+            <w:vAlign w:val="center"/>
+          </w:tcPr>
+          <w:p>
+            <w:pPr>
+              <w:pStyle w:val="Compact"/>
+              <w:spacing w:before="60" w:after="60" w:line="252" w:lineRule="auto"/>
+              <w:jc w:val="left"/>
+            </w:pPr>
+            <w:r>
+              <w:rPr>
+                <w:rStyle w:val="VerbatimChar"/>
+                <w:sz w:val="18"/>
+              </w:rPr>
+              <w:t xml:space="preserve">helpdesk.security</w:t>
+            </w:r>
+          </w:p>
+        </w:tc>
+        <w:tc>
+          <w:tcPr>
+            <w:tcW w:type="dxa" w:w="3792"/>
+            <w:vAlign w:val="center"/>
+          </w:tcPr>
+          <w:p>
+            <w:pPr>
+              <w:pStyle w:val="Compact"/>
+              <w:spacing w:before="60" w:after="60" w:line="252" w:lineRule="auto"/>
+              <w:jc w:val="left"/>
+            </w:pPr>
+            <w:r>
+              <w:rPr>
+                <w:sz w:val="21"/>
+              </w:rPr>
+              <w:t xml:space="preserve">Restringe a abertura ao perfil solicitante</w:t>
+            </w:r>
+          </w:p>
+        </w:tc>
+      </w:tr>
+      <w:tr>
+        <w:trPr>
+          <w:cantSplit/>
+        </w:trPr>
+        <w:tc>
+          <w:tcPr>
+            <w:tcW w:type="dxa" w:w="3592"/>
+            <w:vAlign w:val="center"/>
+          </w:tcPr>
+          <w:p>
+            <w:pPr>
+              <w:pStyle w:val="Compact"/>
+              <w:spacing w:before="60" w:after="60" w:line="252" w:lineRule="auto"/>
+              <w:jc w:val="left"/>
+            </w:pPr>
+            <w:r>
+              <w:rPr>
+                <w:rStyle w:val="VerbatimChar"/>
+                <w:sz w:val="18"/>
+              </w:rPr>
+              <w:t xml:space="preserve">new_ticket()</w:t>
+            </w:r>
+          </w:p>
+        </w:tc>
+        <w:tc>
+          <w:tcPr>
+            <w:tcW w:type="dxa" w:w="2594"/>
+            <w:vAlign w:val="center"/>
+          </w:tcPr>
+          <w:p>
+            <w:pPr>
+              <w:pStyle w:val="Compact"/>
+              <w:spacing w:before="60" w:after="60" w:line="252" w:lineRule="auto"/>
+              <w:jc w:val="left"/>
+            </w:pPr>
+            <w:r>
+              <w:rPr>
+                <w:rStyle w:val="VerbatimChar"/>
+                <w:sz w:val="18"/>
+              </w:rPr>
+              <w:t xml:space="preserve">helpdesk.routes</w:t>
+            </w:r>
+          </w:p>
+        </w:tc>
+        <w:tc>
+          <w:tcPr>
+            <w:tcW w:type="dxa" w:w="3792"/>
+            <w:vAlign w:val="center"/>
+          </w:tcPr>
+          <w:p>
+            <w:pPr>
+              <w:pStyle w:val="Compact"/>
+              <w:spacing w:before="60" w:after="60" w:line="252" w:lineRule="auto"/>
+              <w:jc w:val="left"/>
+            </w:pPr>
+            <w:r>
+              <w:rPr>
+                <w:sz w:val="21"/>
+              </w:rPr>
+              <w:t xml:space="preserve">Exibe o formulário e registra o chamado do solicitante</w:t>
+            </w:r>
+          </w:p>
+        </w:tc>
+      </w:tr>
+      <w:tr>
+        <w:trPr>
+          <w:cantSplit/>
+        </w:trPr>
+        <w:tc>
+          <w:tcPr>
+            <w:tcW w:type="dxa" w:w="3592"/>
+            <w:vAlign w:val="center"/>
+          </w:tcPr>
+          <w:p>
+            <w:pPr>
+              <w:pStyle w:val="Compact"/>
+              <w:spacing w:before="60" w:after="60" w:line="252" w:lineRule="auto"/>
+              <w:jc w:val="left"/>
+            </w:pPr>
+            <w:r>
+              <w:rPr>
+                <w:rStyle w:val="VerbatimChar"/>
+                <w:sz w:val="18"/>
+              </w:rPr>
+              <w:t xml:space="preserve">pre_validate(form)</w:t>
+            </w:r>
+          </w:p>
+        </w:tc>
+        <w:tc>
+          <w:tcPr>
+            <w:tcW w:type="dxa" w:w="2594"/>
+            <w:vAlign w:val="center"/>
+          </w:tcPr>
+          <w:p>
+            <w:pPr>
+              <w:pStyle w:val="Compact"/>
+              <w:spacing w:before="60" w:after="60" w:line="252" w:lineRule="auto"/>
+              <w:jc w:val="left"/>
+            </w:pPr>
+            <w:r>
+              <w:rPr>
+                <w:rStyle w:val="VerbatimChar"/>
+                <w:sz w:val="18"/>
+              </w:rPr>
+              <w:t xml:space="preserve">PortugueseSelectField</w:t>
+            </w:r>
+            <w:r>
+              <w:rPr>
+                <w:sz w:val="21"/>
+              </w:rPr>
+              <w:t xml:space="preserve">, em</w:t>
+            </w:r>
+            <w:r>
+              <w:rPr>
+                <w:sz w:val="21"/>
+              </w:rPr>
+              <w:t xml:space="preserve"> </w:t>
+            </w:r>
+            <w:r>
+              <w:rPr>
+                <w:rStyle w:val="VerbatimChar"/>
+                <w:sz w:val="18"/>
+              </w:rPr>
+              <w:t xml:space="preserve">helpdesk.forms</w:t>
+            </w:r>
+          </w:p>
+        </w:tc>
+        <w:tc>
+          <w:tcPr>
+            <w:tcW w:type="dxa" w:w="3792"/>
+            <w:vAlign w:val="center"/>
+          </w:tcPr>
+          <w:p>
+            <w:pPr>
+              <w:pStyle w:val="Compact"/>
+              <w:spacing w:before="60" w:after="60" w:line="252" w:lineRule="auto"/>
+              <w:jc w:val="left"/>
+            </w:pPr>
+            <w:r>
+              <w:rPr>
+                <w:sz w:val="21"/>
+              </w:rPr>
+              <w:t xml:space="preserve">Valida a categoria selecionada e orienta sua correção</w:t>
+            </w:r>
+          </w:p>
+        </w:tc>
+      </w:tr>
+      <w:tr>
+        <w:trPr>
+          <w:cantSplit/>
+        </w:trPr>
+        <w:tc>
+          <w:tcPr>
+            <w:tcW w:type="dxa" w:w="3592"/>
+            <w:vAlign w:val="center"/>
+          </w:tcPr>
+          <w:p>
+            <w:pPr>
+              <w:pStyle w:val="Compact"/>
+              <w:spacing w:before="60" w:after="60" w:line="252" w:lineRule="auto"/>
+              <w:jc w:val="left"/>
+            </w:pPr>
+            <w:r>
+              <w:rPr>
+                <w:rStyle w:val="VerbatimChar"/>
+                <w:sz w:val="18"/>
+              </w:rPr>
+              <w:t xml:space="preserve">utcnow()</w:t>
+            </w:r>
+          </w:p>
+        </w:tc>
+        <w:tc>
+          <w:tcPr>
+            <w:tcW w:type="dxa" w:w="2594"/>
+            <w:vAlign w:val="center"/>
+          </w:tcPr>
+          <w:p>
+            <w:pPr>
+              <w:pStyle w:val="Compact"/>
+              <w:spacing w:before="60" w:after="60" w:line="252" w:lineRule="auto"/>
+              <w:jc w:val="left"/>
+            </w:pPr>
+            <w:r>
+              <w:rPr>
+                <w:rStyle w:val="VerbatimChar"/>
+                <w:sz w:val="18"/>
+              </w:rPr>
+              <w:t xml:space="preserve">helpdesk.models</w:t>
+            </w:r>
+          </w:p>
+        </w:tc>
+        <w:tc>
+          <w:tcPr>
+            <w:tcW w:type="dxa" w:w="3792"/>
+            <w:vAlign w:val="center"/>
+          </w:tcPr>
+          <w:p>
+            <w:pPr>
+              <w:pStyle w:val="Compact"/>
+              <w:spacing w:before="60" w:after="60" w:line="252" w:lineRule="auto"/>
+              <w:jc w:val="left"/>
+            </w:pPr>
+            <w:r>
+              <w:rPr>
+                <w:sz w:val="21"/>
+              </w:rPr>
+              <w:t xml:space="preserve">Fornece a data e hora de abertura em UTC</w:t>
+            </w:r>
+          </w:p>
+        </w:tc>
+      </w:tr>
+      <w:tr>
+        <w:trPr>
+          <w:cantSplit/>
+        </w:trPr>
+        <w:tc>
+          <w:tcPr>
+            <w:tcW w:type="dxa" w:w="3592"/>
+            <w:vAlign w:val="center"/>
+          </w:tcPr>
+          <w:p>
+            <w:pPr>
+              <w:pStyle w:val="Compact"/>
+              <w:spacing w:before="60" w:after="60" w:line="252" w:lineRule="auto"/>
+              <w:jc w:val="left"/>
+            </w:pPr>
+            <w:r>
+              <w:rPr>
+                <w:rStyle w:val="VerbatimChar"/>
+                <w:sz w:val="18"/>
+              </w:rPr>
+              <w:t xml:space="preserve">ticket_confirmation(ticket_id)</w:t>
+            </w:r>
+          </w:p>
+        </w:tc>
+        <w:tc>
+          <w:tcPr>
+            <w:tcW w:type="dxa" w:w="2594"/>
+            <w:vAlign w:val="center"/>
+          </w:tcPr>
+          <w:p>
+            <w:pPr>
+              <w:pStyle w:val="Compact"/>
+              <w:spacing w:before="60" w:after="60" w:line="252" w:lineRule="auto"/>
+              <w:jc w:val="left"/>
+            </w:pPr>
+            <w:r>
+              <w:rPr>
+                <w:rStyle w:val="VerbatimChar"/>
+                <w:sz w:val="18"/>
+              </w:rPr>
+              <w:t xml:space="preserve">helpdesk.routes</w:t>
+            </w:r>
+          </w:p>
+        </w:tc>
+        <w:tc>
+          <w:tcPr>
+            <w:tcW w:type="dxa" w:w="3792"/>
+            <w:vAlign w:val="center"/>
+          </w:tcPr>
+          <w:p>
+            <w:pPr>
+              <w:pStyle w:val="Compact"/>
+              <w:spacing w:before="60" w:after="60" w:line="252" w:lineRule="auto"/>
+              <w:jc w:val="left"/>
+            </w:pPr>
+            <w:r>
+              <w:rPr>
+                <w:sz w:val="21"/>
+              </w:rPr>
+              <w:t xml:space="preserve">Confere o autor e apresenta protocolo e resumo</w:t>
+            </w:r>
+          </w:p>
+        </w:tc>
+      </w:tr>
+    </w:tbl>
     <w:bookmarkEnd w:id="27"/>
     <w:bookmarkEnd w:id="28"/>
     <w:bookmarkStart w:id="45" w:name="diagramas-uml"/>
     <w:p>
       <w:pPr>
         <w:pStyle w:val="Heading2"/>
+        <w:pageBreakBefore/>
       </w:pPr>
       <w:r>
         <w:t xml:space="preserve">6. Diagramas UML</w:t>
@@ -1305,7 +2388,7 @@
       <w:r>
         <w:drawing>
           <wp:inline>
-            <wp:extent cx="5333998" cy="2947486"/>
+            <wp:extent cx="5333998" cy="4095786"/>
             <wp:effectExtent b="0" l="0" r="0" t="0"/>
             <wp:docPr descr="Figura 2. Sequência de acesso ao sistema." title="" id="34" name="Picture"/>
             <a:graphic>
@@ -1326,7 +2409,7 @@
                   <pic:spPr bwMode="auto">
                     <a:xfrm>
                       <a:off x="0" y="0"/>
-                      <a:ext cx="5333998" cy="2947486"/>
+                      <a:ext cx="5333998" cy="4095786"/>
                     </a:xfrm>
                     <a:prstGeom prst="rect">
                       <a:avLst/>
@@ -1382,7 +2465,7 @@
       <w:r>
         <w:drawing>
           <wp:inline>
-            <wp:extent cx="5333998" cy="3351377"/>
+            <wp:extent cx="4679999" cy="3299541"/>
             <wp:effectExtent b="0" l="0" r="0" t="0"/>
             <wp:docPr descr="Figura 3. Sequência de saída da conta." title="" id="38" name="Picture"/>
             <a:graphic>
@@ -1403,7 +2486,7 @@
                   <pic:spPr bwMode="auto">
                     <a:xfrm>
                       <a:off x="0" y="0"/>
-                      <a:ext cx="5333998" cy="3351377"/>
+                      <a:ext cx="4679999" cy="3299541"/>
                     </a:xfrm>
                     <a:prstGeom prst="rect">
                       <a:avLst/>
@@ -1460,7 +2543,7 @@
       <w:r>
         <w:drawing>
           <wp:inline>
-            <wp:extent cx="5333998" cy="3902518"/>
+            <wp:extent cx="5333999" cy="5804901"/>
             <wp:effectExtent b="0" l="0" r="0" t="0"/>
             <wp:docPr descr="Figura 4. Sequência de registro de um chamado." title="" id="42" name="Picture"/>
             <a:graphic>
@@ -1481,7 +2564,7 @@
                   <pic:spPr bwMode="auto">
                     <a:xfrm>
                       <a:off x="0" y="0"/>
-                      <a:ext cx="5333998" cy="3902518"/>
+                      <a:ext cx="5333999" cy="5804901"/>
                     </a:xfrm>
                     <a:prstGeom prst="rect">
                       <a:avLst/>

</xml_diff>